<commit_message>
Masters client-feedback pass: English-US conversion, figures instead of number words, page-self-references removed (brand voice = Maverick Business Academy London), converter headings US; Cursor content skill added; all 50 DOCX regenerated
Co-authored-by: arena-agent <297053741+arena-agent@users.noreply.github.com>
</commit_message>
<xml_diff>
--- a/landing-page/program-detail/girne-american-university/executive-mba/01-emba-in-educational-leadership.docx
+++ b/landing-page/program-detail/girne-american-university/executive-mba/01-emba-in-educational-leadership.docx
@@ -38,7 +38,7 @@
         <w:t xml:space="preserve">Meta Description: </w:t>
       </w:r>
       <w:r>
-        <w:t>12 to 18-month Executive MBA in Educational Leadership from Girne American University. Online senior cohort, AED instalments. Enquire now.</w:t>
+        <w:t>12 to 18-month Executive MBA in Educational Leadership from Girne American University. Online senior cohort, AED installments. Enquire now.</w:t>
       </w:r>
     </w:p>
     <w:p>
@@ -126,7 +126,7 @@
         <w:pStyle w:val="Heading2"/>
       </w:pPr>
       <w:r>
-        <w:t>Programme at a Glance</w:t>
+        <w:t>Program At A Glance</w:t>
       </w:r>
     </w:p>
     <w:tbl>
@@ -331,12 +331,12 @@
         <w:pStyle w:val="Heading2"/>
       </w:pPr>
       <w:r>
-        <w:t>Programme Overview</w:t>
+        <w:t>Program Overview</w:t>
       </w:r>
     </w:p>
     <w:p>
       <w:r>
-        <w:t>The Gulf's school sector grew faster than its leadership bench, and everyone in it knows it. This Executive MBA answers that gap directly. The executive core covers strategy, finance, human resources, and operations, then the coursework turns each of those disciplines toward educational institutions: planning and development, leading in a digital age, managing the organizational behaviour of schools, which is its own complicated art.</w:t>
+        <w:t>The Gulf's school sector grew faster than its leadership bench, and everyone in it knows it. This Executive MBA answers that gap directly. The executive core covers strategy, finance, human resources, and operations, then the coursework turns each of those disciplines toward educational institutions: planning and development, leading in a digital age, managing the organizational behavior of schools, which is its own complicated art.</w:t>
       </w:r>
     </w:p>
     <w:p>
@@ -349,7 +349,7 @@
         <w:pStyle w:val="Heading2"/>
       </w:pPr>
       <w:r>
-        <w:t>Why Choose This Programme</w:t>
+        <w:t>Why Choose This Program</w:t>
       </w:r>
     </w:p>
     <w:p>
@@ -383,12 +383,12 @@
         <w:rPr>
           <w:b/>
         </w:rPr>
-        <w:t>Eighteen months at the outside</w:t>
+        <w:t>18 months at the outside</w:t>
       </w:r>
     </w:p>
     <w:p>
       <w:r>
-        <w:t>Education leaders rarely get sabbaticals. Twelve to eighteen months, arranged around the school calendar, is the honest version of executive study.</w:t>
+        <w:t>Education leaders rarely get sabbaticals. 12 to 18 months, arranged around the school calendar, is the honest version of executive study.</w:t>
       </w:r>
     </w:p>
     <w:p>
@@ -401,7 +401,7 @@
     </w:p>
     <w:p>
       <w:r>
-        <w:t>Take the final investigation from your own institution, an enrolment question, a retention problem, a staffing model, and finish with a plan your board can act on.</w:t>
+        <w:t>Take the final investigation from your own institution, an enrollment question, a retention problem, a staffing model, and finish with a plan your board can act on.</w:t>
       </w:r>
     </w:p>
     <w:p>
@@ -409,12 +409,12 @@
         <w:rPr>
           <w:b/>
         </w:rPr>
-        <w:t>Instalments in dirhams</w:t>
+        <w:t>Installments in dirhams</w:t>
       </w:r>
     </w:p>
     <w:p>
       <w:r>
-        <w:t>Monthly AED payments, interest-free, agreed in writing before the programme starts.</w:t>
+        <w:t>Monthly AED payments, interest-free, agreed in writing before the program starts.</w:t>
       </w:r>
     </w:p>
     <w:p>
@@ -558,7 +558,7 @@
         <w:pStyle w:val="ListBullet"/>
       </w:pPr>
       <w:r>
-        <w:t>Education Programme Director</w:t>
+        <w:t>Education Program Director</w:t>
       </w:r>
     </w:p>
     <w:p>
@@ -606,7 +606,7 @@
         <w:pStyle w:val="Heading2"/>
       </w:pPr>
       <w:r>
-        <w:t>Programme Structure</w:t>
+        <w:t>Program Structure</w:t>
       </w:r>
     </w:p>
     <w:p>
@@ -666,7 +666,7 @@
         <w:pStyle w:val="ListBullet"/>
       </w:pPr>
       <w:r>
-        <w:t>Leading education in the twenty-first century</w:t>
+        <w:t>Leading education in the 21st century</w:t>
       </w:r>
     </w:p>
     <w:p>
@@ -682,7 +682,7 @@
         <w:pStyle w:val="ListBullet"/>
       </w:pPr>
       <w:r>
-        <w:t>Leadership and organizational behaviour in educational settings</w:t>
+        <w:t>Leadership and organizational behavior in educational settings</w:t>
       </w:r>
     </w:p>
     <w:p>
@@ -745,7 +745,7 @@
               <w:rPr>
                 <w:sz w:val="20"/>
               </w:rPr>
-              <w:t>One success coach from enrolment to graduation</w:t>
+              <w:t>One success coach from enrollment to graduation</w:t>
             </w:r>
           </w:p>
         </w:tc>
@@ -819,7 +819,7 @@
                 <w:b/>
                 <w:sz w:val="20"/>
               </w:rPr>
-              <w:t>Affordable instalments</w:t>
+              <w:t>Affordable installments</w:t>
             </w:r>
           </w:p>
         </w:tc>
@@ -890,7 +890,7 @@
               <w:rPr>
                 <w:sz w:val="20"/>
               </w:rPr>
-              <w:t>Enrolment done with you, one step at a time</w:t>
+              <w:t>Enrollment done with you, one step at a time</w:t>
             </w:r>
           </w:p>
         </w:tc>
@@ -961,7 +961,7 @@
         <w:rPr>
           <w:b/>
         </w:rPr>
-        <w:t>Eighteen months suits the school calendar</w:t>
+        <w:t>18 months suits the school calendar</w:t>
       </w:r>
     </w:p>
     <w:p>
@@ -1070,7 +1070,7 @@
                 <w:b/>
                 <w:sz w:val="20"/>
               </w:rPr>
-              <w:t>Monthly Instalments</w:t>
+              <w:t>Monthly Installments</w:t>
             </w:r>
           </w:p>
         </w:tc>
@@ -1155,7 +1155,7 @@
         <w:t xml:space="preserve">Request the fee structure: </w:t>
       </w:r>
       <w:r>
-        <w:t>Fees depend on the intake and your admission profile, so no fixed figure sits here. Admissions sends the personal breakdown in writing, free and without obligation. Across our Master's programmes, totals usually land between AED 16,000 and 40,000.</w:t>
+        <w:t>Fees depend on the intake and your admission profile, so no fixed figure sits here. Admissions sends the personal breakdown in writing, free and without obligation. Across our Master's programs, totals usually land between AED 16,000 and 40,000.</w:t>
       </w:r>
     </w:p>
     <w:sectPr>

</xml_diff>